<commit_message>
cleanup: remove unused docs, bots, components, and old pitch version
Remove ALLONE-AI-ARCHITECTURE.md, IMPLEMENTATION_PLAN.md, SALES_AGENT_PLAN.md,
linkedin-bot/, social-bot/, linkedin-extension/, and unused UI components
(FlipCard, ServiceExpandCard, ColorWave, etc.). Simplify pitch to clean
single-page version with bilingual support and AI chat. Update dashboard
and studio to remove deprecated voice/rag/automations features.

Co-Authored-By: Claude Opus 4.6 <noreply@anthropic.com>
</commit_message>
<xml_diff>
--- a/public/allone-investor-memo.docx
+++ b/public/allone-investor-memo.docx
@@ -2,22 +2,12 @@
 <file path=word/document.xml><?xml version="1.0" encoding="utf-8"?>
 <w:document xmlns:wpc="http://schemas.microsoft.com/office/word/2010/wordprocessingCanvas" xmlns:mo="http://schemas.microsoft.com/office/mac/office/2008/main" xmlns:mc="http://schemas.openxmlformats.org/markup-compatibility/2006" xmlns:mv="urn:schemas-microsoft-com:mac:vml" xmlns:o="urn:schemas-microsoft-com:office:office" xmlns:r="http://schemas.openxmlformats.org/officeDocument/2006/relationships" xmlns:m="http://schemas.openxmlformats.org/officeDocument/2006/math" xmlns:v="urn:schemas-microsoft-com:vml" xmlns:wp14="http://schemas.microsoft.com/office/word/2010/wordprocessingDrawing" xmlns:wp="http://schemas.openxmlformats.org/drawingml/2006/wordprocessingDrawing" xmlns:w10="urn:schemas-microsoft-com:office:word" xmlns:w="http://schemas.openxmlformats.org/wordprocessingml/2006/main" xmlns:w14="http://schemas.microsoft.com/office/word/2010/wordml" xmlns:wpg="http://schemas.microsoft.com/office/word/2010/wordprocessingGroup" xmlns:wpi="http://schemas.microsoft.com/office/word/2010/wordprocessingInk" xmlns:wne="http://schemas.microsoft.com/office/word/2006/wordml" xmlns:wps="http://schemas.microsoft.com/office/word/2010/wordprocessingShape" mc:Ignorable="w14 wp14">
   <w:body>
-    <w:p/>
-    <w:p/>
-    <w:p/>
-    <w:p/>
-    <w:p/>
-    <w:p/>
     <w:p>
       <w:pPr>
+        <w:pStyle w:val="Title"/>
         <w:jc w:val="center"/>
       </w:pPr>
       <w:r>
-        <w:rPr>
-          <w:b/>
-          <w:color w:val="1D1D1F"/>
-          <w:sz w:val="96"/>
-        </w:rPr>
         <w:t>ALLONE</w:t>
       </w:r>
     </w:p>
@@ -27,43 +17,60 @@
       </w:pPr>
       <w:r>
         <w:rPr>
-          <w:color w:val="6E6E73"/>
-          <w:sz w:val="36"/>
+          <w:sz w:val="28"/>
         </w:rPr>
-        <w:t>AI Automation for Small &amp; Medium Businesses</w:t>
+        <w:t>Investor Memorandum</w:t>
       </w:r>
     </w:p>
     <w:p/>
     <w:p>
       <w:pPr>
-        <w:jc w:val="center"/>
+        <w:pStyle w:val="Heading1"/>
       </w:pPr>
       <w:r>
-        <w:rPr>
-          <w:color w:val="86868B"/>
-          <w:sz w:val="28"/>
-        </w:rPr>
-        <w:t>Tbilisi, Georgia</w:t>
-      </w:r>
-    </w:p>
-    <w:p/>
-    <w:p/>
-    <w:p>
-      <w:pPr>
-        <w:jc w:val="center"/>
-      </w:pPr>
-      <w:r>
-        <w:rPr>
-          <w:i/>
-          <w:color w:val="86868B"/>
-          <w:sz w:val="20"/>
-        </w:rPr>
-        <w:t>CONFIDENTIAL INVESTOR MEMO</w:t>
+        <w:t>1. What We Do</w:t>
       </w:r>
     </w:p>
     <w:p>
       <w:r>
-        <w:br w:type="page"/>
+        <w:t>Allone is a technology service company. We consult, build, and maintain AI systems for businesses through a 4-step process:</w:t>
+      </w:r>
+    </w:p>
+    <w:p>
+      <w:pPr>
+        <w:pStyle w:val="ListBullet"/>
+      </w:pPr>
+      <w:r>
+        <w:t>Consultation — Analyze automation needs</w:t>
+      </w:r>
+    </w:p>
+    <w:p>
+      <w:pPr>
+        <w:pStyle w:val="ListBullet"/>
+      </w:pPr>
+      <w:r>
+        <w:t>Planning — Design the AI solution</w:t>
+      </w:r>
+    </w:p>
+    <w:p>
+      <w:pPr>
+        <w:pStyle w:val="ListBullet"/>
+      </w:pPr>
+      <w:r>
+        <w:t>Execution — Build and deploy in 1 week</w:t>
+      </w:r>
+    </w:p>
+    <w:p>
+      <w:pPr>
+        <w:pStyle w:val="ListBullet"/>
+      </w:pPr>
+      <w:r>
+        <w:t>Support — Monthly maintenance and fixes</w:t>
+      </w:r>
+    </w:p>
+    <w:p>
+      <w:r>
+        <w:t>Like hiring a consulting firm + IT department — for $300/month.</w:t>
       </w:r>
     </w:p>
     <w:p>
@@ -71,108 +78,39 @@
         <w:pStyle w:val="Heading1"/>
       </w:pPr>
       <w:r>
-        <w:t>Table of Contents</w:t>
+        <w:t>2. Products</w:t>
       </w:r>
     </w:p>
     <w:p>
       <w:pPr>
-        <w:spacing w:after="120"/>
+        <w:pStyle w:val="ListBullet"/>
       </w:pPr>
       <w:r>
-        <w:t>1. Executive Summary</w:t>
+        <w:t>Voice Agents — AI answers phones, books appointments 24/7</w:t>
       </w:r>
     </w:p>
     <w:p>
       <w:pPr>
-        <w:spacing w:after="120"/>
+        <w:pStyle w:val="ListBullet"/>
       </w:pPr>
       <w:r>
-        <w:t>2. The Problem</w:t>
+        <w:t>Smart Chatbots — Trained on business docs, answers customers</w:t>
       </w:r>
     </w:p>
     <w:p>
       <w:pPr>
-        <w:spacing w:after="120"/>
+        <w:pStyle w:val="ListBullet"/>
       </w:pPr>
       <w:r>
-        <w:t>3. Our Solution</w:t>
+        <w:t>Workflow Automations — Emails, data entry, follow-ups</w:t>
       </w:r>
     </w:p>
     <w:p>
       <w:pPr>
-        <w:spacing w:after="120"/>
+        <w:pStyle w:val="ListBullet"/>
       </w:pPr>
       <w:r>
-        <w:t>4. Market Opportunity</w:t>
-      </w:r>
-    </w:p>
-    <w:p>
-      <w:pPr>
-        <w:spacing w:after="120"/>
-      </w:pPr>
-      <w:r>
-        <w:t>5. Revenue Model &amp; Unit Economics</w:t>
-      </w:r>
-    </w:p>
-    <w:p>
-      <w:pPr>
-        <w:spacing w:after="120"/>
-      </w:pPr>
-      <w:r>
-        <w:t>6. Competitive Advantage: Georgia</w:t>
-      </w:r>
-    </w:p>
-    <w:p>
-      <w:pPr>
-        <w:spacing w:after="120"/>
-      </w:pPr>
-      <w:r>
-        <w:t>7. Investment Plan (Three Phases)</w:t>
-      </w:r>
-    </w:p>
-    <w:p>
-      <w:pPr>
-        <w:spacing w:after="120"/>
-      </w:pPr>
-      <w:r>
-        <w:t>8. Financial Projections</w:t>
-      </w:r>
-    </w:p>
-    <w:p>
-      <w:pPr>
-        <w:spacing w:after="120"/>
-      </w:pPr>
-      <w:r>
-        <w:t>9. Return Scenarios</w:t>
-      </w:r>
-    </w:p>
-    <w:p>
-      <w:pPr>
-        <w:spacing w:after="120"/>
-      </w:pPr>
-      <w:r>
-        <w:t>10. Team &amp; Strengths</w:t>
-      </w:r>
-    </w:p>
-    <w:p>
-      <w:pPr>
-        <w:spacing w:after="120"/>
-      </w:pPr>
-      <w:r>
-        <w:t>11. The Ask</w:t>
-      </w:r>
-    </w:p>
-    <w:p>
-      <w:pPr>
-        <w:spacing w:after="120"/>
-      </w:pPr>
-      <w:r>
-        <w:t>12. Risk Factors &amp; Mitigations</w:t>
-      </w:r>
-    </w:p>
-    <w:p>
-      <w:r>
-        <w:br w:type="page"/>
+        <w:t>Custom AI Solutions — $2K-$10K per project</w:t>
       </w:r>
     </w:p>
     <w:p>
@@ -180,195 +118,26 @@
         <w:pStyle w:val="Heading1"/>
       </w:pPr>
       <w:r>
-        <w:t>1. Executive Summary</w:t>
+        <w:t>3. Unit Economics</w:t>
       </w:r>
     </w:p>
     <w:p>
       <w:r>
-        <w:t>Allone is an AI automation company based in Tbilisi, Georgia, that provides affordable AI tools to small and medium businesses. We offer voice agents, smart chatbots, and workflow automations at $300/month — making AI accessible to businesses that cannot afford custom development.</w:t>
-      </w:r>
-    </w:p>
-    <w:p>
-      <w:r>
-        <w:t>We are seeking a total investment of $1.24M deployed across three milestone-based phases, offering 40% equity in the company. Each phase is tied to clear deliverables: the investor only commits additional capital after we prove each milestone.</w:t>
-      </w:r>
-    </w:p>
-    <w:p>
-      <w:pPr>
-        <w:pStyle w:val="Heading2"/>
-      </w:pPr>
-      <w:r>
-        <w:t>Key Metrics</w:t>
-      </w:r>
-    </w:p>
-    <w:tbl>
-      <w:tblPr>
-        <w:tblStyle w:val="LightGrid-Accent1"/>
-        <w:tblW w:type="auto" w:w="0"/>
-        <w:tblLook w:firstColumn="1" w:firstRow="1" w:lastColumn="0" w:lastRow="0" w:noHBand="0" w:noVBand="1" w:val="04A0"/>
-      </w:tblPr>
-      <w:tblGrid>
-        <w:gridCol w:w="4320"/>
-        <w:gridCol w:w="4320"/>
-      </w:tblGrid>
-      <w:tr>
-        <w:tc>
-          <w:tcPr>
-            <w:tcW w:type="dxa" w:w="4320"/>
-          </w:tcPr>
-          <w:p>
-            <w:r>
-              <w:t>Monthly Price per Customer</w:t>
-            </w:r>
-          </w:p>
-        </w:tc>
-        <w:tc>
-          <w:tcPr>
-            <w:tcW w:type="dxa" w:w="4320"/>
-          </w:tcPr>
-          <w:p>
-            <w:r>
-              <w:t>$300</w:t>
-            </w:r>
-          </w:p>
-        </w:tc>
-      </w:tr>
-      <w:tr>
-        <w:tc>
-          <w:tcPr>
-            <w:tcW w:type="dxa" w:w="4320"/>
-          </w:tcPr>
-          <w:p>
-            <w:r>
-              <w:t>Cost to Serve per Customer</w:t>
-            </w:r>
-          </w:p>
-        </w:tc>
-        <w:tc>
-          <w:tcPr>
-            <w:tcW w:type="dxa" w:w="4320"/>
-          </w:tcPr>
-          <w:p>
-            <w:r>
-              <w:t>$90</w:t>
-            </w:r>
-          </w:p>
-        </w:tc>
-      </w:tr>
-      <w:tr>
-        <w:tc>
-          <w:tcPr>
-            <w:tcW w:type="dxa" w:w="4320"/>
-          </w:tcPr>
-          <w:p>
-            <w:r>
-              <w:t>Gross Margin</w:t>
-            </w:r>
-          </w:p>
-        </w:tc>
-        <w:tc>
-          <w:tcPr>
-            <w:tcW w:type="dxa" w:w="4320"/>
-          </w:tcPr>
-          <w:p>
-            <w:r>
-              <w:t>70%</w:t>
-            </w:r>
-          </w:p>
-        </w:tc>
-      </w:tr>
-      <w:tr>
-        <w:tc>
-          <w:tcPr>
-            <w:tcW w:type="dxa" w:w="4320"/>
-          </w:tcPr>
-          <w:p>
-            <w:r>
-              <w:t>Average Customer Lifetime</w:t>
-            </w:r>
-          </w:p>
-        </w:tc>
-        <w:tc>
-          <w:tcPr>
-            <w:tcW w:type="dxa" w:w="4320"/>
-          </w:tcPr>
-          <w:p>
-            <w:r>
-              <w:t>15 months</w:t>
-            </w:r>
-          </w:p>
-        </w:tc>
-      </w:tr>
-      <w:tr>
-        <w:tc>
-          <w:tcPr>
-            <w:tcW w:type="dxa" w:w="4320"/>
-          </w:tcPr>
-          <w:p>
-            <w:r>
-              <w:t>Customer Lifetime Value</w:t>
-            </w:r>
-          </w:p>
-        </w:tc>
-        <w:tc>
-          <w:tcPr>
-            <w:tcW w:type="dxa" w:w="4320"/>
-          </w:tcPr>
-          <w:p>
-            <w:r>
-              <w:t>$3,150</w:t>
-            </w:r>
-          </w:p>
-        </w:tc>
-      </w:tr>
-      <w:tr>
-        <w:tc>
-          <w:tcPr>
-            <w:tcW w:type="dxa" w:w="4320"/>
-          </w:tcPr>
-          <w:p>
-            <w:r>
-              <w:t>Current Team Size</w:t>
-            </w:r>
-          </w:p>
-        </w:tc>
-        <w:tc>
-          <w:tcPr>
-            <w:tcW w:type="dxa" w:w="4320"/>
-          </w:tcPr>
-          <w:p>
-            <w:r>
-              <w:t>10 (commission-based sales)</w:t>
-            </w:r>
-          </w:p>
-        </w:tc>
-      </w:tr>
-      <w:tr>
-        <w:tc>
-          <w:tcPr>
-            <w:tcW w:type="dxa" w:w="4320"/>
-          </w:tcPr>
-          <w:p>
-            <w:r>
-              <w:t>Current Monthly Burn</w:t>
-            </w:r>
-          </w:p>
-        </w:tc>
-        <w:tc>
-          <w:tcPr>
-            <w:tcW w:type="dxa" w:w="4320"/>
-          </w:tcPr>
-          <w:p>
-            <w:r>
-              <w:t>$500</w:t>
-            </w:r>
-          </w:p>
-        </w:tc>
-      </w:tr>
-    </w:tbl>
-    <w:p>
-      <w:r>
-        <w:br w:type="page"/>
+        <w:t>Monthly fee: $300/client</w:t>
+        <w:br/>
+        <w:t>Infrastructure cost: $90/client (30%)</w:t>
+        <w:br/>
+        <w:t>Gross profit: $210/client/month (70%)</w:t>
+        <w:br/>
+        <w:t>Avg lifetime: 15 months (6.7% monthly churn)</w:t>
+        <w:br/>
+        <w:t>LTV: $4,500</w:t>
+        <w:br/>
+        <w:t>CAC: $225 (sales commission)</w:t>
+        <w:br/>
+        <w:t>LTV/CAC: 14x</w:t>
+        <w:br/>
+        <w:t>Payback: 1.07 months</w:t>
       </w:r>
     </w:p>
     <w:p>
@@ -376,12 +145,130 @@
         <w:pStyle w:val="Heading1"/>
       </w:pPr>
       <w:r>
-        <w:t>2. The Problem</w:t>
+        <w:t>4. Sales Model</w:t>
       </w:r>
     </w:p>
     <w:p>
       <w:r>
-        <w:t>Small businesses across emerging markets face a critical challenge: they need AI to compete, but they cannot access it.</w:t>
+        <w:t>Commission-based team (zero fixed salary):</w:t>
+        <w:br/>
+        <w:t>- Starting: 6 salespeople</w:t>
+        <w:br/>
+        <w:t>- Each: ~3 clients/month (1.5 in first month for new hires)</w:t>
+        <w:br/>
+        <w:t>- Commission: $225/deal (25% of first 3 months)</w:t>
+        <w:br/>
+        <w:t>- Sales cycle: 1 week</w:t>
+        <w:br/>
+        <w:t>- Grows to 15 by Month 12</w:t>
+      </w:r>
+    </w:p>
+    <w:p>
+      <w:pPr>
+        <w:pStyle w:val="Heading1"/>
+      </w:pPr>
+      <w:r>
+        <w:t>5. Year 1 Projection</w:t>
+      </w:r>
+    </w:p>
+    <w:p>
+      <w:r>
+        <w:t>Model: salespeople x 3 deals/month - 6.7% churn</w:t>
+        <w:br/>
+        <w:t>Office: $1,500/month ALL 12 months</w:t>
+        <w:br/>
+        <w:br/>
+        <w:t>Milestones:</w:t>
+        <w:br/>
+        <w:t>- Month 1: 6 sales, 2 tech, 27 clients, $5,550/mo</w:t>
+        <w:br/>
+        <w:t>- Month 3: Break-even — 58 clients, $15,150/mo</w:t>
+        <w:br/>
+        <w:t>- Month 6: 10 sales, 3 tech, 115 clients, $31,350/mo</w:t>
+        <w:br/>
+        <w:t>- Month 9: 12 sales, 3 tech, 186 clients, $52,050/mo</w:t>
+        <w:br/>
+        <w:t>- Month 12: 15 sales, 4 tech, 264 clients, $75,150/mo</w:t>
+        <w:br/>
+        <w:br/>
+        <w:t>Year 1 Revenue: $444,300</w:t>
+        <w:br/>
+        <w:t>Year 1 Costs: $296,915</w:t>
+        <w:br/>
+        <w:t>Year 1 Net Profit: $147,385</w:t>
+        <w:br/>
+        <w:t>Cash (from $40K investment): $187,385</w:t>
+      </w:r>
+    </w:p>
+    <w:p>
+      <w:pPr>
+        <w:pStyle w:val="Heading1"/>
+      </w:pPr>
+      <w:r>
+        <w:t>6. Cost Structure</w:t>
+      </w:r>
+    </w:p>
+    <w:p>
+      <w:r>
+        <w:t>Fixed:</w:t>
+        <w:br/>
+        <w:t>- Office: $18,000/year (6.1%)</w:t>
+        <w:br/>
+        <w:t>- Tech team: $68,000/year (22.9%)</w:t>
+        <w:br/>
+        <w:br/>
+        <w:t>Variable:</w:t>
+        <w:br/>
+        <w:t>- Infrastructure: ~$127,215 (42.8%)</w:t>
+        <w:br/>
+        <w:t>- Commissions: ~$83,700 (28.2%)</w:t>
+        <w:br/>
+        <w:br/>
+        <w:t>Total: $296,915</w:t>
+      </w:r>
+    </w:p>
+    <w:p>
+      <w:pPr>
+        <w:pStyle w:val="Heading1"/>
+      </w:pPr>
+      <w:r>
+        <w:t>7. Investment</w:t>
+      </w:r>
+    </w:p>
+    <w:p>
+      <w:r>
+        <w:t>$1.24M total for 40% equity — 3 stages:</w:t>
+        <w:br/>
+        <w:br/>
+        <w:t>Stage 1 (Now): $40K for 10%</w:t>
+        <w:br/>
+        <w:t>- Office (12mo), sales (6-&gt;10), tech team (2)</w:t>
+        <w:br/>
+        <w:t>- Unlock: $6K/mo revenue, 20+ clients</w:t>
+        <w:br/>
+        <w:t>- Risk: Stop after 6 months if no proof</w:t>
+        <w:br/>
+        <w:br/>
+        <w:t>Stage 2: $200K for 15%</w:t>
+        <w:br/>
+        <w:t>- Own servers (-50% infra), 15-20 sales</w:t>
+        <w:br/>
+        <w:t>- Unlock: 50+ clients, $30K+/mo</w:t>
+        <w:br/>
+        <w:br/>
+        <w:t>Stage 3: $1M for 15%</w:t>
+        <w:br/>
+        <w:t>- Caucasus expansion, 30+ sales</w:t>
+        <w:br/>
+        <w:t>- Unlock: 200+ clients, profitable</w:t>
+      </w:r>
+    </w:p>
+    <w:p>
+      <w:pPr>
+        <w:pStyle w:val="Heading1"/>
+      </w:pPr>
+      <w:r>
+        <w:t>8. Why This Works</w:t>
       </w:r>
     </w:p>
     <w:p>
@@ -389,7 +276,7 @@
         <w:pStyle w:val="ListBullet"/>
       </w:pPr>
       <w:r>
-        <w:t>Hiring an AI developer costs $150,000+/year — impossible for most SMBs</w:t>
+        <w:t>No fixed sales costs — commission only</w:t>
       </w:r>
     </w:p>
     <w:p>
@@ -397,7 +284,7 @@
         <w:pStyle w:val="ListBullet"/>
       </w:pPr>
       <w:r>
-        <w:t>Custom AI solutions take 6-12 months to build and deploy</w:t>
+        <w:t>High margins — 70%, improving to 88% with own servers</w:t>
       </w:r>
     </w:p>
     <w:p>
@@ -405,7 +292,7 @@
         <w:pStyle w:val="ListBullet"/>
       </w:pPr>
       <w:r>
-        <w:t>Most businesses are stuck with manual, repetitive work that costs them growth</w:t>
+        <w:t>Recurring revenue — 15-month avg lifetime</w:t>
       </w:r>
     </w:p>
     <w:p>
@@ -413,86 +300,7 @@
         <w:pStyle w:val="ListBullet"/>
       </w:pPr>
       <w:r>
-        <w:t>90% of small businesses want AI but don't know where to start</w:t>
-      </w:r>
-    </w:p>
-    <w:p>
-      <w:r>
-        <w:br/>
-        <w:t>The result: a massive underserved market of millions of businesses that are ready to pay for AI solutions if someone makes them affordable and simple.</w:t>
-      </w:r>
-    </w:p>
-    <w:p>
-      <w:r>
-        <w:br w:type="page"/>
-      </w:r>
-    </w:p>
-    <w:p>
-      <w:pPr>
-        <w:pStyle w:val="Heading1"/>
-      </w:pPr>
-      <w:r>
-        <w:t>3. Our Solution</w:t>
-      </w:r>
-    </w:p>
-    <w:p>
-      <w:r>
-        <w:t>Allone provides ready-made AI tools that work out of the box, priced at $300/month. Think of it as hiring a digital employee that never sleeps — for $10/day.</w:t>
-      </w:r>
-    </w:p>
-    <w:p>
-      <w:pPr>
-        <w:pStyle w:val="Heading2"/>
-      </w:pPr>
-      <w:r>
-        <w:t>Products</w:t>
-      </w:r>
-    </w:p>
-    <w:p>
-      <w:pPr>
-        <w:pStyle w:val="Heading3"/>
-      </w:pPr>
-      <w:r>
-        <w:t>Voice Agents</w:t>
-      </w:r>
-    </w:p>
-    <w:p>
-      <w:r>
-        <w:t>AI answers your phone 24/7, books appointments, takes orders, handles customer service calls. No human operator needed.</w:t>
-      </w:r>
-    </w:p>
-    <w:p>
-      <w:pPr>
-        <w:pStyle w:val="Heading3"/>
-      </w:pPr>
-      <w:r>
-        <w:t>Smart Chatbots (RAG)</w:t>
-      </w:r>
-    </w:p>
-    <w:p>
-      <w:r>
-        <w:t>AI learns your business documents and answers customer questions accurately. Trained on your specific data — manuals, pricing, FAQs.</w:t>
-      </w:r>
-    </w:p>
-    <w:p>
-      <w:pPr>
-        <w:pStyle w:val="Heading3"/>
-      </w:pPr>
-      <w:r>
-        <w:t>Workflow Automations</w:t>
-      </w:r>
-    </w:p>
-    <w:p>
-      <w:r>
-        <w:t>AI handles repetitive tasks: email responses, data entry, follow-ups, social media posting, lead qualification.</w:t>
-      </w:r>
-    </w:p>
-    <w:p>
-      <w:pPr>
-        <w:pStyle w:val="Heading2"/>
-      </w:pPr>
-      <w:r>
-        <w:t>Three-Layer Business Model</w:t>
+        <w:t>Break-even Month 3 — self-sustaining quickly</w:t>
       </w:r>
     </w:p>
     <w:p>
@@ -500,12 +308,7 @@
         <w:pStyle w:val="ListBullet"/>
       </w:pPr>
       <w:r>
-        <w:t>Layer 1: Infrastructure (Data Servers)</w:t>
-      </w:r>
-    </w:p>
-    <w:p>
-      <w:r>
-        <w:t xml:space="preserve">  Own and operate GPU servers for AI processing. Provides cost control, data sovereignty, and resale opportunity.</w:t>
+        <w:t>Simple product — "AI for $300/month"</w:t>
       </w:r>
     </w:p>
     <w:p>
@@ -513,1930 +316,7 @@
         <w:pStyle w:val="ListBullet"/>
       </w:pPr>
       <w:r>
-        <w:t>Layer 2: Distribution (Affiliate Network)</w:t>
-      </w:r>
-    </w:p>
-    <w:p>
-      <w:r>
-        <w:t xml:space="preserve">  Partner with business consultation centres who sell our products on commission. Scalable sales without fixed costs.</w:t>
-      </w:r>
-    </w:p>
-    <w:p>
-      <w:pPr>
-        <w:pStyle w:val="ListBullet"/>
-      </w:pPr>
-      <w:r>
-        <w:t>Layer 3: Platform (AI Studio)</w:t>
-      </w:r>
-    </w:p>
-    <w:p>
-      <w:r>
-        <w:t xml:space="preserve">  Self-service web platform where developers and non-technical users can create RAGs, voice agents, automations, and websites directly through our AI.</w:t>
-      </w:r>
-    </w:p>
-    <w:p>
-      <w:r>
-        <w:br w:type="page"/>
-      </w:r>
-    </w:p>
-    <w:p>
-      <w:pPr>
-        <w:pStyle w:val="Heading1"/>
-      </w:pPr>
-      <w:r>
-        <w:t>4. Market Opportunity</w:t>
-      </w:r>
-    </w:p>
-    <w:p>
-      <w:r>
-        <w:t>The AI automation market is projected to exceed $200 billion by 2030. Our specific segment — AI tools for SMBs — represents a $15 billion opportunity.</w:t>
-      </w:r>
-    </w:p>
-    <w:tbl>
-      <w:tblPr>
-        <w:tblStyle w:val="LightGrid-Accent1"/>
-        <w:tblW w:type="auto" w:w="0"/>
-        <w:tblLook w:firstColumn="1" w:firstRow="1" w:lastColumn="0" w:lastRow="0" w:noHBand="0" w:noVBand="1" w:val="04A0"/>
-      </w:tblPr>
-      <w:tblGrid>
-        <w:gridCol w:w="2880"/>
-        <w:gridCol w:w="2880"/>
-        <w:gridCol w:w="2880"/>
-      </w:tblGrid>
-      <w:tr>
-        <w:tc>
-          <w:tcPr>
-            <w:tcW w:type="dxa" w:w="2880"/>
-          </w:tcPr>
-          <w:p>
-            <w:r>
-              <w:t>Market Layer</w:t>
-            </w:r>
-          </w:p>
-        </w:tc>
-        <w:tc>
-          <w:tcPr>
-            <w:tcW w:type="dxa" w:w="2880"/>
-          </w:tcPr>
-          <w:p>
-            <w:r>
-              <w:t>Size</w:t>
-            </w:r>
-          </w:p>
-        </w:tc>
-        <w:tc>
-          <w:tcPr>
-            <w:tcW w:type="dxa" w:w="2880"/>
-          </w:tcPr>
-          <w:p>
-            <w:r>
-              <w:t>Description</w:t>
-            </w:r>
-          </w:p>
-        </w:tc>
-      </w:tr>
-      <w:tr>
-        <w:tc>
-          <w:tcPr>
-            <w:tcW w:type="dxa" w:w="2880"/>
-          </w:tcPr>
-          <w:p>
-            <w:r>
-              <w:t>Total Addressable Market (TAM)</w:t>
-            </w:r>
-          </w:p>
-        </w:tc>
-        <w:tc>
-          <w:tcPr>
-            <w:tcW w:type="dxa" w:w="2880"/>
-          </w:tcPr>
-          <w:p>
-            <w:r>
-              <w:t>$200B+</w:t>
-            </w:r>
-          </w:p>
-        </w:tc>
-        <w:tc>
-          <w:tcPr>
-            <w:tcW w:type="dxa" w:w="2880"/>
-          </w:tcPr>
-          <w:p>
-            <w:r>
-              <w:t>Global AI automation</w:t>
-            </w:r>
-          </w:p>
-        </w:tc>
-      </w:tr>
-      <w:tr>
-        <w:tc>
-          <w:tcPr>
-            <w:tcW w:type="dxa" w:w="2880"/>
-          </w:tcPr>
-          <w:p>
-            <w:r>
-              <w:t>Serviceable Market (SAM)</w:t>
-            </w:r>
-          </w:p>
-        </w:tc>
-        <w:tc>
-          <w:tcPr>
-            <w:tcW w:type="dxa" w:w="2880"/>
-          </w:tcPr>
-          <w:p>
-            <w:r>
-              <w:t>$15B</w:t>
-            </w:r>
-          </w:p>
-        </w:tc>
-        <w:tc>
-          <w:tcPr>
-            <w:tcW w:type="dxa" w:w="2880"/>
-          </w:tcPr>
-          <w:p>
-            <w:r>
-              <w:t>SMB AI tools segment</w:t>
-            </w:r>
-          </w:p>
-        </w:tc>
-      </w:tr>
-      <w:tr>
-        <w:tc>
-          <w:tcPr>
-            <w:tcW w:type="dxa" w:w="2880"/>
-          </w:tcPr>
-          <w:p>
-            <w:r>
-              <w:t>Year 3 Target (SOM)</w:t>
-            </w:r>
-          </w:p>
-        </w:tc>
-        <w:tc>
-          <w:tcPr>
-            <w:tcW w:type="dxa" w:w="2880"/>
-          </w:tcPr>
-          <w:p>
-            <w:r>
-              <w:t>$2M</w:t>
-            </w:r>
-          </w:p>
-        </w:tc>
-        <w:tc>
-          <w:tcPr>
-            <w:tcW w:type="dxa" w:w="2880"/>
-          </w:tcPr>
-          <w:p>
-            <w:r>
-              <w:t>Realistic annual revenue</w:t>
-            </w:r>
-          </w:p>
-        </w:tc>
-      </w:tr>
-    </w:tbl>
-    <w:p>
-      <w:r>
-        <w:br/>
-        <w:t>Comparable AI automation companies (like Zapier, Make.com, Bland AI) have grown 10-50x in 2-3 years. We have a significant cost advantage operating from Georgia.</w:t>
-      </w:r>
-    </w:p>
-    <w:p>
-      <w:r>
-        <w:br w:type="page"/>
-      </w:r>
-    </w:p>
-    <w:p>
-      <w:pPr>
-        <w:pStyle w:val="Heading1"/>
-      </w:pPr>
-      <w:r>
-        <w:t>5. Revenue Model &amp; Unit Economics</w:t>
-      </w:r>
-    </w:p>
-    <w:p>
-      <w:pPr>
-        <w:pStyle w:val="Heading2"/>
-      </w:pPr>
-      <w:r>
-        <w:t>Pricing</w:t>
-      </w:r>
-    </w:p>
-    <w:p>
-      <w:r>
-        <w:t>Average monthly subscription: $300 per customer</w:t>
-      </w:r>
-    </w:p>
-    <w:p>
-      <w:r>
-        <w:t>This includes AI agent hosting, maintenance, and support.</w:t>
-      </w:r>
-    </w:p>
-    <w:p>
-      <w:pPr>
-        <w:pStyle w:val="Heading2"/>
-      </w:pPr>
-      <w:r>
-        <w:t>Unit Economics</w:t>
-      </w:r>
-    </w:p>
-    <w:tbl>
-      <w:tblPr>
-        <w:tblStyle w:val="LightGrid-Accent1"/>
-        <w:tblW w:type="auto" w:w="0"/>
-        <w:tblLook w:firstColumn="1" w:firstRow="1" w:lastColumn="0" w:lastRow="0" w:noHBand="0" w:noVBand="1" w:val="04A0"/>
-      </w:tblPr>
-      <w:tblGrid>
-        <w:gridCol w:w="4320"/>
-        <w:gridCol w:w="4320"/>
-      </w:tblGrid>
-      <w:tr>
-        <w:tc>
-          <w:tcPr>
-            <w:tcW w:type="dxa" w:w="4320"/>
-          </w:tcPr>
-          <w:p>
-            <w:r>
-              <w:t>Monthly Revenue per Customer</w:t>
-            </w:r>
-          </w:p>
-        </w:tc>
-        <w:tc>
-          <w:tcPr>
-            <w:tcW w:type="dxa" w:w="4320"/>
-          </w:tcPr>
-          <w:p>
-            <w:r>
-              <w:t>$300</w:t>
-            </w:r>
-          </w:p>
-        </w:tc>
-      </w:tr>
-      <w:tr>
-        <w:tc>
-          <w:tcPr>
-            <w:tcW w:type="dxa" w:w="4320"/>
-          </w:tcPr>
-          <w:p>
-            <w:r>
-              <w:t>AI API Costs (Claude, hosting)</w:t>
-            </w:r>
-          </w:p>
-        </w:tc>
-        <w:tc>
-          <w:tcPr>
-            <w:tcW w:type="dxa" w:w="4320"/>
-          </w:tcPr>
-          <w:p>
-            <w:r>
-              <w:t>$50</w:t>
-            </w:r>
-          </w:p>
-        </w:tc>
-      </w:tr>
-      <w:tr>
-        <w:tc>
-          <w:tcPr>
-            <w:tcW w:type="dxa" w:w="4320"/>
-          </w:tcPr>
-          <w:p>
-            <w:r>
-              <w:t>Infrastructure &amp; Support</w:t>
-            </w:r>
-          </w:p>
-        </w:tc>
-        <w:tc>
-          <w:tcPr>
-            <w:tcW w:type="dxa" w:w="4320"/>
-          </w:tcPr>
-          <w:p>
-            <w:r>
-              <w:t>$40</w:t>
-            </w:r>
-          </w:p>
-        </w:tc>
-      </w:tr>
-      <w:tr>
-        <w:tc>
-          <w:tcPr>
-            <w:tcW w:type="dxa" w:w="4320"/>
-          </w:tcPr>
-          <w:p>
-            <w:r>
-              <w:t>Total Cost to Serve</w:t>
-            </w:r>
-          </w:p>
-        </w:tc>
-        <w:tc>
-          <w:tcPr>
-            <w:tcW w:type="dxa" w:w="4320"/>
-          </w:tcPr>
-          <w:p>
-            <w:r>
-              <w:t>$90</w:t>
-            </w:r>
-          </w:p>
-        </w:tc>
-      </w:tr>
-      <w:tr>
-        <w:tc>
-          <w:tcPr>
-            <w:tcW w:type="dxa" w:w="4320"/>
-          </w:tcPr>
-          <w:p>
-            <w:r>
-              <w:t>Gross Profit per Customer</w:t>
-            </w:r>
-          </w:p>
-        </w:tc>
-        <w:tc>
-          <w:tcPr>
-            <w:tcW w:type="dxa" w:w="4320"/>
-          </w:tcPr>
-          <w:p>
-            <w:r>
-              <w:t>$210 (70% margin)</w:t>
-            </w:r>
-          </w:p>
-        </w:tc>
-      </w:tr>
-      <w:tr>
-        <w:tc>
-          <w:tcPr>
-            <w:tcW w:type="dxa" w:w="4320"/>
-          </w:tcPr>
-          <w:p>
-            <w:r>
-              <w:t>Customer Lifetime Value (15 mo avg)</w:t>
-            </w:r>
-          </w:p>
-        </w:tc>
-        <w:tc>
-          <w:tcPr>
-            <w:tcW w:type="dxa" w:w="4320"/>
-          </w:tcPr>
-          <w:p>
-            <w:r>
-              <w:t>$3,150</w:t>
-            </w:r>
-          </w:p>
-        </w:tc>
-      </w:tr>
-    </w:tbl>
-    <w:p>
-      <w:pPr>
-        <w:pStyle w:val="Heading2"/>
-      </w:pPr>
-      <w:r>
-        <w:t>Sales Model</w:t>
-      </w:r>
-    </w:p>
-    <w:p>
-      <w:r>
-        <w:t>Commission-only salespeople (25% of first 3 months = $225 per deal)</w:t>
-      </w:r>
-    </w:p>
-    <w:p>
-      <w:r>
-        <w:t>Current: 6 active salespeople</w:t>
-      </w:r>
-    </w:p>
-    <w:p>
-      <w:r>
-        <w:t>Target: 20 salespeople within 12 months</w:t>
-      </w:r>
-    </w:p>
-    <w:p>
-      <w:r>
-        <w:t>Average close rate: 3 deals per salesperson per month</w:t>
-      </w:r>
-    </w:p>
-    <w:p>
-      <w:r>
-        <w:t>Sales cycle: ~1 week (B2B but simple product)</w:t>
-      </w:r>
-    </w:p>
-    <w:p>
-      <w:pPr>
-        <w:pStyle w:val="Heading2"/>
-      </w:pPr>
-      <w:r>
-        <w:t>Revenue Formula</w:t>
-      </w:r>
-    </w:p>
-    <w:p>
-      <w:r>
-        <w:t>Monthly New Clients = Salespeople × 3 deals/month</w:t>
-      </w:r>
-    </w:p>
-    <w:p>
-      <w:r>
-        <w:t>Monthly Revenue Growth = New Clients × $300</w:t>
-      </w:r>
-    </w:p>
-    <w:p>
-      <w:r>
-        <w:t>Example: 20 salespeople × 3 = 60 new clients/month × $300 = $18,000 MRR added monthly</w:t>
-      </w:r>
-    </w:p>
-    <w:p>
-      <w:r>
-        <w:br w:type="page"/>
-      </w:r>
-    </w:p>
-    <w:p>
-      <w:pPr>
-        <w:pStyle w:val="Heading1"/>
-      </w:pPr>
-      <w:r>
-        <w:t>6. Competitive Advantage: Georgia</w:t>
-      </w:r>
-    </w:p>
-    <w:p>
-      <w:r>
-        <w:t>Operating from Tbilisi gives us 3-5x cost advantages over US/EU competitors while serving the same global market.</w:t>
-      </w:r>
-    </w:p>
-    <w:tbl>
-      <w:tblPr>
-        <w:tblStyle w:val="LightGrid-Accent1"/>
-        <w:tblW w:type="auto" w:w="0"/>
-        <w:tblLook w:firstColumn="1" w:firstRow="1" w:lastColumn="0" w:lastRow="0" w:noHBand="0" w:noVBand="1" w:val="04A0"/>
-      </w:tblPr>
-      <w:tblGrid>
-        <w:gridCol w:w="2160"/>
-        <w:gridCol w:w="2160"/>
-        <w:gridCol w:w="2160"/>
-        <w:gridCol w:w="2160"/>
-      </w:tblGrid>
-      <w:tr>
-        <w:tc>
-          <w:tcPr>
-            <w:tcW w:type="dxa" w:w="2160"/>
-          </w:tcPr>
-          <w:p>
-            <w:r>
-              <w:t>Cost Item</w:t>
-            </w:r>
-          </w:p>
-        </w:tc>
-        <w:tc>
-          <w:tcPr>
-            <w:tcW w:type="dxa" w:w="2160"/>
-          </w:tcPr>
-          <w:p>
-            <w:r>
-              <w:t>Georgia</w:t>
-            </w:r>
-          </w:p>
-        </w:tc>
-        <w:tc>
-          <w:tcPr>
-            <w:tcW w:type="dxa" w:w="2160"/>
-          </w:tcPr>
-          <w:p>
-            <w:r>
-              <w:t>USA</w:t>
-            </w:r>
-          </w:p>
-        </w:tc>
-        <w:tc>
-          <w:tcPr>
-            <w:tcW w:type="dxa" w:w="2160"/>
-          </w:tcPr>
-          <w:p>
-            <w:r>
-              <w:t>Savings</w:t>
-            </w:r>
-          </w:p>
-        </w:tc>
-      </w:tr>
-      <w:tr>
-        <w:tc>
-          <w:tcPr>
-            <w:tcW w:type="dxa" w:w="2160"/>
-          </w:tcPr>
-          <w:p>
-            <w:r>
-              <w:t>Developer salary</w:t>
-            </w:r>
-          </w:p>
-        </w:tc>
-        <w:tc>
-          <w:tcPr>
-            <w:tcW w:type="dxa" w:w="2160"/>
-          </w:tcPr>
-          <w:p>
-            <w:r>
-              <w:t>$2,500/mo</w:t>
-            </w:r>
-          </w:p>
-        </w:tc>
-        <w:tc>
-          <w:tcPr>
-            <w:tcW w:type="dxa" w:w="2160"/>
-          </w:tcPr>
-          <w:p>
-            <w:r>
-              <w:t>$12,000/mo</w:t>
-            </w:r>
-          </w:p>
-        </w:tc>
-        <w:tc>
-          <w:tcPr>
-            <w:tcW w:type="dxa" w:w="2160"/>
-          </w:tcPr>
-          <w:p>
-            <w:r>
-              <w:t>5x cheaper</w:t>
-            </w:r>
-          </w:p>
-        </w:tc>
-      </w:tr>
-      <w:tr>
-        <w:tc>
-          <w:tcPr>
-            <w:tcW w:type="dxa" w:w="2160"/>
-          </w:tcPr>
-          <w:p>
-            <w:r>
-              <w:t>Electricity (data center)</w:t>
-            </w:r>
-          </w:p>
-        </w:tc>
-        <w:tc>
-          <w:tcPr>
-            <w:tcW w:type="dxa" w:w="2160"/>
-          </w:tcPr>
-          <w:p>
-            <w:r>
-              <w:t>$0.10/kWh</w:t>
-            </w:r>
-          </w:p>
-        </w:tc>
-        <w:tc>
-          <w:tcPr>
-            <w:tcW w:type="dxa" w:w="2160"/>
-          </w:tcPr>
-          <w:p>
-            <w:r>
-              <w:t>$0.17/kWh</w:t>
-            </w:r>
-          </w:p>
-        </w:tc>
-        <w:tc>
-          <w:tcPr>
-            <w:tcW w:type="dxa" w:w="2160"/>
-          </w:tcPr>
-          <w:p>
-            <w:r>
-              <w:t>40% cheaper</w:t>
-            </w:r>
-          </w:p>
-        </w:tc>
-      </w:tr>
-      <w:tr>
-        <w:tc>
-          <w:tcPr>
-            <w:tcW w:type="dxa" w:w="2160"/>
-          </w:tcPr>
-          <w:p>
-            <w:r>
-              <w:t>Office &amp; operations</w:t>
-            </w:r>
-          </w:p>
-        </w:tc>
-        <w:tc>
-          <w:tcPr>
-            <w:tcW w:type="dxa" w:w="2160"/>
-          </w:tcPr>
-          <w:p>
-            <w:r>
-              <w:t>$1,500/mo</w:t>
-            </w:r>
-          </w:p>
-        </w:tc>
-        <w:tc>
-          <w:tcPr>
-            <w:tcW w:type="dxa" w:w="2160"/>
-          </w:tcPr>
-          <w:p>
-            <w:r>
-              <w:t>$8,000/mo</w:t>
-            </w:r>
-          </w:p>
-        </w:tc>
-        <w:tc>
-          <w:tcPr>
-            <w:tcW w:type="dxa" w:w="2160"/>
-          </w:tcPr>
-          <w:p>
-            <w:r>
-              <w:t>5x cheaper</w:t>
-            </w:r>
-          </w:p>
-        </w:tc>
-      </w:tr>
-    </w:tbl>
-    <w:p/>
-    <w:p>
-      <w:pPr>
-        <w:pStyle w:val="ListBullet"/>
-      </w:pPr>
-      <w:r>
-        <w:t>Additional Advantages:</w:t>
-      </w:r>
-    </w:p>
-    <w:p>
-      <w:r>
-        <w:t xml:space="preserve">  0% income tax for first 3 years (Georgian government innovation program)</w:t>
-      </w:r>
-    </w:p>
-    <w:p>
-      <w:r>
-        <w:t xml:space="preserve">  Access to GITA grants and matching fund programs</w:t>
-      </w:r>
-    </w:p>
-    <w:p>
-      <w:r>
-        <w:t xml:space="preserve">  Growing tech talent pool in Tbilisi</w:t>
-      </w:r>
-    </w:p>
-    <w:p>
-      <w:r>
-        <w:t xml:space="preserve">  Strategic location between Europe and Asia</w:t>
-      </w:r>
-    </w:p>
-    <w:p>
-      <w:r>
-        <w:br w:type="page"/>
-      </w:r>
-    </w:p>
-    <w:p>
-      <w:pPr>
-        <w:pStyle w:val="Heading1"/>
-      </w:pPr>
-      <w:r>
-        <w:t>7. Investment Plan (Three Phases)</w:t>
-      </w:r>
-    </w:p>
-    <w:p>
-      <w:r>
-        <w:t>We propose a milestone-based investment structure. The investor commits additional capital only after each phase milestone is achieved. This minimizes risk while maximizing returns.</w:t>
-      </w:r>
-    </w:p>
-    <w:p>
-      <w:pPr>
-        <w:pStyle w:val="Heading2"/>
-      </w:pPr>
-      <w:r>
-        <w:t>Phase 1: Build &amp; Launch — $40,000 for 10% equity</w:t>
-      </w:r>
-    </w:p>
-    <w:p>
-      <w:r>
-        <w:t>Timeline: Months 0-6</w:t>
-      </w:r>
-    </w:p>
-    <w:p>
-      <w:r>
-        <w:t>Milestone: Working product + first paying customers + first revenue</w:t>
-      </w:r>
-    </w:p>
-    <w:p>
-      <w:pPr>
-        <w:pStyle w:val="Heading3"/>
-      </w:pPr>
-      <w:r>
-        <w:t>Use of Funds:</w:t>
-      </w:r>
-    </w:p>
-    <w:p>
-      <w:pPr>
-        <w:pStyle w:val="ListBullet"/>
-      </w:pPr>
-      <w:r>
-        <w:t>Product development and refinement: $15,000</w:t>
-      </w:r>
-    </w:p>
-    <w:p>
-      <w:pPr>
-        <w:pStyle w:val="ListBullet"/>
-      </w:pPr>
-      <w:r>
-        <w:t>Initial AI API costs and infrastructure: $10,000</w:t>
-      </w:r>
-    </w:p>
-    <w:p>
-      <w:pPr>
-        <w:pStyle w:val="ListBullet"/>
-      </w:pPr>
-      <w:r>
-        <w:t>Sales team expansion (commission advances): $8,000</w:t>
-      </w:r>
-    </w:p>
-    <w:p>
-      <w:pPr>
-        <w:pStyle w:val="ListBullet"/>
-      </w:pPr>
-      <w:r>
-        <w:t>Marketing and lead generation: $5,000</w:t>
-      </w:r>
-    </w:p>
-    <w:p>
-      <w:pPr>
-        <w:pStyle w:val="ListBullet"/>
-      </w:pPr>
-      <w:r>
-        <w:t>Legal and operational setup: $2,000</w:t>
-      </w:r>
-    </w:p>
-    <w:p>
-      <w:pPr>
-        <w:pStyle w:val="Heading3"/>
-      </w:pPr>
-      <w:r>
-        <w:t>Deliverables:</w:t>
-      </w:r>
-    </w:p>
-    <w:p>
-      <w:pPr>
-        <w:pStyle w:val="ListBullet"/>
-      </w:pPr>
-      <w:r>
-        <w:t>Fully functional AI Studio platform</w:t>
-      </w:r>
-    </w:p>
-    <w:p>
-      <w:pPr>
-        <w:pStyle w:val="ListBullet"/>
-      </w:pPr>
-      <w:r>
-        <w:t>10-20 paying customers</w:t>
-      </w:r>
-    </w:p>
-    <w:p>
-      <w:pPr>
-        <w:pStyle w:val="ListBullet"/>
-      </w:pPr>
-      <w:r>
-        <w:t>$3,000-6,000 monthly recurring revenue</w:t>
-      </w:r>
-    </w:p>
-    <w:p>
-      <w:pPr>
-        <w:pStyle w:val="Heading2"/>
-      </w:pPr>
-      <w:r>
-        <w:t>Phase 2: Data Center &amp; Scale — $200,000 for 15% equity</w:t>
-      </w:r>
-    </w:p>
-    <w:p>
-      <w:r>
-        <w:t>Timeline: Months 6-18</w:t>
-      </w:r>
-    </w:p>
-    <w:p>
-      <w:r>
-        <w:t>Milestone: Own GPU infrastructure + scaled sales team</w:t>
-      </w:r>
-    </w:p>
-    <w:p>
-      <w:pPr>
-        <w:pStyle w:val="Heading3"/>
-      </w:pPr>
-      <w:r>
-        <w:t>Use of Funds:</w:t>
-      </w:r>
-    </w:p>
-    <w:p>
-      <w:pPr>
-        <w:pStyle w:val="ListBullet"/>
-      </w:pPr>
-      <w:r>
-        <w:t>GPU server infrastructure (data center): $120,000</w:t>
-      </w:r>
-    </w:p>
-    <w:p>
-      <w:pPr>
-        <w:pStyle w:val="ListBullet"/>
-      </w:pPr>
-      <w:r>
-        <w:t>Data center facility and setup: $30,000</w:t>
-      </w:r>
-    </w:p>
-    <w:p>
-      <w:pPr>
-        <w:pStyle w:val="ListBullet"/>
-      </w:pPr>
-      <w:r>
-        <w:t>Sales team scaling (15-20 people): $25,000</w:t>
-      </w:r>
-    </w:p>
-    <w:p>
-      <w:pPr>
-        <w:pStyle w:val="ListBullet"/>
-      </w:pPr>
-      <w:r>
-        <w:t>Product development (new features): $15,000</w:t>
-      </w:r>
-    </w:p>
-    <w:p>
-      <w:pPr>
-        <w:pStyle w:val="ListBullet"/>
-      </w:pPr>
-      <w:r>
-        <w:t>Operations and overhead: $10,000</w:t>
-      </w:r>
-    </w:p>
-    <w:p>
-      <w:pPr>
-        <w:pStyle w:val="Heading3"/>
-      </w:pPr>
-      <w:r>
-        <w:t>Deliverables:</w:t>
-      </w:r>
-    </w:p>
-    <w:p>
-      <w:pPr>
-        <w:pStyle w:val="ListBullet"/>
-      </w:pPr>
-      <w:r>
-        <w:t>Own GPU servers (cuts ongoing costs by 60%)</w:t>
-      </w:r>
-    </w:p>
-    <w:p>
-      <w:pPr>
-        <w:pStyle w:val="ListBullet"/>
-      </w:pPr>
-      <w:r>
-        <w:t>50-100 paying customers</w:t>
-      </w:r>
-    </w:p>
-    <w:p>
-      <w:pPr>
-        <w:pStyle w:val="ListBullet"/>
-      </w:pPr>
-      <w:r>
-        <w:t>$15,000-30,000 monthly recurring revenue</w:t>
-      </w:r>
-    </w:p>
-    <w:p>
-      <w:pPr>
-        <w:pStyle w:val="Heading2"/>
-      </w:pPr>
-      <w:r>
-        <w:t>Phase 3: Proven Model &amp; Growth — $1,000,000 for 15% equity</w:t>
-      </w:r>
-    </w:p>
-    <w:p>
-      <w:r>
-        <w:t>Timeline: Months 18-36</w:t>
-      </w:r>
-    </w:p>
-    <w:p>
-      <w:r>
-        <w:t>Milestone: Proven unit economics + rapid customer acquisition</w:t>
-      </w:r>
-    </w:p>
-    <w:p>
-      <w:pPr>
-        <w:pStyle w:val="Heading3"/>
-      </w:pPr>
-      <w:r>
-        <w:t>Use of Funds:</w:t>
-      </w:r>
-    </w:p>
-    <w:p>
-      <w:pPr>
-        <w:pStyle w:val="ListBullet"/>
-      </w:pPr>
-      <w:r>
-        <w:t>Additional data center capacity: $500,000</w:t>
-      </w:r>
-    </w:p>
-    <w:p>
-      <w:pPr>
-        <w:pStyle w:val="ListBullet"/>
-      </w:pPr>
-      <w:r>
-        <w:t>International expansion (sales teams in 3+ markets): $200,000</w:t>
-      </w:r>
-    </w:p>
-    <w:p>
-      <w:pPr>
-        <w:pStyle w:val="ListBullet"/>
-      </w:pPr>
-      <w:r>
-        <w:t>Product R&amp;D (new AI capabilities): $150,000</w:t>
-      </w:r>
-    </w:p>
-    <w:p>
-      <w:pPr>
-        <w:pStyle w:val="ListBullet"/>
-      </w:pPr>
-      <w:r>
-        <w:t>Marketing and brand building: $100,000</w:t>
-      </w:r>
-    </w:p>
-    <w:p>
-      <w:pPr>
-        <w:pStyle w:val="ListBullet"/>
-      </w:pPr>
-      <w:r>
-        <w:t>Working capital and reserves: $50,000</w:t>
-      </w:r>
-    </w:p>
-    <w:p>
-      <w:pPr>
-        <w:pStyle w:val="Heading3"/>
-      </w:pPr>
-      <w:r>
-        <w:t>Deliverables:</w:t>
-      </w:r>
-    </w:p>
-    <w:p>
-      <w:pPr>
-        <w:pStyle w:val="ListBullet"/>
-      </w:pPr>
-      <w:r>
-        <w:t>200+ paying customers</w:t>
-      </w:r>
-    </w:p>
-    <w:p>
-      <w:pPr>
-        <w:pStyle w:val="ListBullet"/>
-      </w:pPr>
-      <w:r>
-        <w:t>$60,000+ monthly recurring revenue</w:t>
-      </w:r>
-    </w:p>
-    <w:p>
-      <w:pPr>
-        <w:pStyle w:val="ListBullet"/>
-      </w:pPr>
-      <w:r>
-        <w:t>Profitable operations</w:t>
-      </w:r>
-    </w:p>
-    <w:p>
-      <w:pPr>
-        <w:pStyle w:val="ListBullet"/>
-      </w:pPr>
-      <w:r>
-        <w:t>International presence</w:t>
-      </w:r>
-    </w:p>
-    <w:p>
-      <w:r>
-        <w:br w:type="page"/>
-      </w:r>
-    </w:p>
-    <w:p>
-      <w:pPr>
-        <w:pStyle w:val="Heading1"/>
-      </w:pPr>
-      <w:r>
-        <w:t>8. Financial Projections (36-Month Conservative)</w:t>
-      </w:r>
-    </w:p>
-    <w:p>
-      <w:r>
-        <w:t>See accompanying Excel file for detailed monthly projections.</w:t>
-      </w:r>
-    </w:p>
-    <w:p>
-      <w:pPr>
-        <w:pStyle w:val="Heading2"/>
-      </w:pPr>
-      <w:r>
-        <w:t>Summary by Year</w:t>
-      </w:r>
-    </w:p>
-    <w:tbl>
-      <w:tblPr>
-        <w:tblStyle w:val="LightGrid-Accent1"/>
-        <w:tblW w:type="auto" w:w="0"/>
-        <w:tblLook w:firstColumn="1" w:firstRow="1" w:lastColumn="0" w:lastRow="0" w:noHBand="0" w:noVBand="1" w:val="04A0"/>
-      </w:tblPr>
-      <w:tblGrid>
-        <w:gridCol w:w="1728"/>
-        <w:gridCol w:w="1728"/>
-        <w:gridCol w:w="1728"/>
-        <w:gridCol w:w="1728"/>
-        <w:gridCol w:w="1728"/>
-      </w:tblGrid>
-      <w:tr>
-        <w:tc>
-          <w:tcPr>
-            <w:tcW w:type="dxa" w:w="1728"/>
-          </w:tcPr>
-          <w:p>
-            <w:r/>
-          </w:p>
-        </w:tc>
-        <w:tc>
-          <w:tcPr>
-            <w:tcW w:type="dxa" w:w="1728"/>
-          </w:tcPr>
-          <w:p>
-            <w:r>
-              <w:t>Year 1</w:t>
-            </w:r>
-          </w:p>
-        </w:tc>
-        <w:tc>
-          <w:tcPr>
-            <w:tcW w:type="dxa" w:w="1728"/>
-          </w:tcPr>
-          <w:p>
-            <w:r>
-              <w:t>Year 2</w:t>
-            </w:r>
-          </w:p>
-        </w:tc>
-        <w:tc>
-          <w:tcPr>
-            <w:tcW w:type="dxa" w:w="1728"/>
-          </w:tcPr>
-          <w:p>
-            <w:r>
-              <w:t>Year 3</w:t>
-            </w:r>
-          </w:p>
-        </w:tc>
-        <w:tc>
-          <w:tcPr>
-            <w:tcW w:type="dxa" w:w="1728"/>
-          </w:tcPr>
-          <w:p>
-            <w:r>
-              <w:t>Cumulative</w:t>
-            </w:r>
-          </w:p>
-        </w:tc>
-      </w:tr>
-      <w:tr>
-        <w:tc>
-          <w:tcPr>
-            <w:tcW w:type="dxa" w:w="1728"/>
-          </w:tcPr>
-          <w:p>
-            <w:r>
-              <w:t>Revenue</w:t>
-            </w:r>
-          </w:p>
-        </w:tc>
-        <w:tc>
-          <w:tcPr>
-            <w:tcW w:type="dxa" w:w="1728"/>
-          </w:tcPr>
-          <w:p>
-            <w:r>
-              <w:t>$108K</w:t>
-            </w:r>
-          </w:p>
-        </w:tc>
-        <w:tc>
-          <w:tcPr>
-            <w:tcW w:type="dxa" w:w="1728"/>
-          </w:tcPr>
-          <w:p>
-            <w:r>
-              <w:t>$540K</w:t>
-            </w:r>
-          </w:p>
-        </w:tc>
-        <w:tc>
-          <w:tcPr>
-            <w:tcW w:type="dxa" w:w="1728"/>
-          </w:tcPr>
-          <w:p>
-            <w:r>
-              <w:t>$1.44M</w:t>
-            </w:r>
-          </w:p>
-        </w:tc>
-        <w:tc>
-          <w:tcPr>
-            <w:tcW w:type="dxa" w:w="1728"/>
-          </w:tcPr>
-          <w:p>
-            <w:r>
-              <w:t>$2.09M</w:t>
-            </w:r>
-          </w:p>
-        </w:tc>
-      </w:tr>
-      <w:tr>
-        <w:tc>
-          <w:tcPr>
-            <w:tcW w:type="dxa" w:w="1728"/>
-          </w:tcPr>
-          <w:p>
-            <w:r>
-              <w:t>Operating Costs</w:t>
-            </w:r>
-          </w:p>
-        </w:tc>
-        <w:tc>
-          <w:tcPr>
-            <w:tcW w:type="dxa" w:w="1728"/>
-          </w:tcPr>
-          <w:p>
-            <w:r>
-              <w:t>$85K</w:t>
-            </w:r>
-          </w:p>
-        </w:tc>
-        <w:tc>
-          <w:tcPr>
-            <w:tcW w:type="dxa" w:w="1728"/>
-          </w:tcPr>
-          <w:p>
-            <w:r>
-              <w:t>$380K</w:t>
-            </w:r>
-          </w:p>
-        </w:tc>
-        <w:tc>
-          <w:tcPr>
-            <w:tcW w:type="dxa" w:w="1728"/>
-          </w:tcPr>
-          <w:p>
-            <w:r>
-              <w:t>$720K</w:t>
-            </w:r>
-          </w:p>
-        </w:tc>
-        <w:tc>
-          <w:tcPr>
-            <w:tcW w:type="dxa" w:w="1728"/>
-          </w:tcPr>
-          <w:p>
-            <w:r>
-              <w:t>$1.19M</w:t>
-            </w:r>
-          </w:p>
-        </w:tc>
-      </w:tr>
-      <w:tr>
-        <w:tc>
-          <w:tcPr>
-            <w:tcW w:type="dxa" w:w="1728"/>
-          </w:tcPr>
-          <w:p>
-            <w:r>
-              <w:t>Net Profit</w:t>
-            </w:r>
-          </w:p>
-        </w:tc>
-        <w:tc>
-          <w:tcPr>
-            <w:tcW w:type="dxa" w:w="1728"/>
-          </w:tcPr>
-          <w:p>
-            <w:r>
-              <w:t>$23K</w:t>
-            </w:r>
-          </w:p>
-        </w:tc>
-        <w:tc>
-          <w:tcPr>
-            <w:tcW w:type="dxa" w:w="1728"/>
-          </w:tcPr>
-          <w:p>
-            <w:r>
-              <w:t>$160K</w:t>
-            </w:r>
-          </w:p>
-        </w:tc>
-        <w:tc>
-          <w:tcPr>
-            <w:tcW w:type="dxa" w:w="1728"/>
-          </w:tcPr>
-          <w:p>
-            <w:r>
-              <w:t>$720K</w:t>
-            </w:r>
-          </w:p>
-        </w:tc>
-        <w:tc>
-          <w:tcPr>
-            <w:tcW w:type="dxa" w:w="1728"/>
-          </w:tcPr>
-          <w:p>
-            <w:r>
-              <w:t>$903K</w:t>
-            </w:r>
-          </w:p>
-        </w:tc>
-      </w:tr>
-    </w:tbl>
-    <w:p>
-      <w:pPr>
-        <w:pStyle w:val="Heading2"/>
-      </w:pPr>
-      <w:r>
-        <w:t>Key Assumptions</w:t>
-      </w:r>
-    </w:p>
-    <w:p>
-      <w:pPr>
-        <w:pStyle w:val="ListBullet"/>
-      </w:pPr>
-      <w:r>
-        <w:t>$300/month average revenue per customer</w:t>
-      </w:r>
-    </w:p>
-    <w:p>
-      <w:pPr>
-        <w:pStyle w:val="ListBullet"/>
-      </w:pPr>
-      <w:r>
-        <w:t>70% gross margin after AI API and hosting costs</w:t>
-      </w:r>
-    </w:p>
-    <w:p>
-      <w:pPr>
-        <w:pStyle w:val="ListBullet"/>
-      </w:pPr>
-      <w:r>
-        <w:t>3 new customers per salesperson per month</w:t>
-      </w:r>
-    </w:p>
-    <w:p>
-      <w:pPr>
-        <w:pStyle w:val="ListBullet"/>
-      </w:pPr>
-      <w:r>
-        <w:t>15-month average customer lifetime</w:t>
-      </w:r>
-    </w:p>
-    <w:p>
-      <w:pPr>
-        <w:pStyle w:val="ListBullet"/>
-      </w:pPr>
-      <w:r>
-        <w:t>5% monthly churn rate</w:t>
-      </w:r>
-    </w:p>
-    <w:p>
-      <w:pPr>
-        <w:pStyle w:val="ListBullet"/>
-      </w:pPr>
-      <w:r>
-        <w:t>Sales team grows from 6 to 20 over 12 months</w:t>
-      </w:r>
-    </w:p>
-    <w:p>
-      <w:pPr>
-        <w:pStyle w:val="ListBullet"/>
-      </w:pPr>
-      <w:r>
-        <w:t>Data center reduces per-customer costs by 60% after Month 12</w:t>
-      </w:r>
-    </w:p>
-    <w:p>
-      <w:r>
-        <w:br w:type="page"/>
-      </w:r>
-    </w:p>
-    <w:p>
-      <w:pPr>
-        <w:pStyle w:val="Heading1"/>
-      </w:pPr>
-      <w:r>
-        <w:t>9. Return Scenarios (3-5 Year Horizon)</w:t>
-      </w:r>
-    </w:p>
-    <w:p>
-      <w:r>
-        <w:t>Total investment: $1.24M for 40% ownership. The following scenarios show potential returns based on revenue multiples common in B2B SaaS.</w:t>
-      </w:r>
-    </w:p>
-    <w:tbl>
-      <w:tblPr>
-        <w:tblStyle w:val="LightGrid-Accent1"/>
-        <w:tblW w:type="auto" w:w="0"/>
-        <w:tblLook w:firstColumn="1" w:firstRow="1" w:lastColumn="0" w:lastRow="0" w:noHBand="0" w:noVBand="1" w:val="04A0"/>
-      </w:tblPr>
-      <w:tblGrid>
-        <w:gridCol w:w="1728"/>
-        <w:gridCol w:w="1728"/>
-        <w:gridCol w:w="1728"/>
-        <w:gridCol w:w="1728"/>
-        <w:gridCol w:w="1728"/>
-      </w:tblGrid>
-      <w:tr>
-        <w:tc>
-          <w:tcPr>
-            <w:tcW w:type="dxa" w:w="1728"/>
-          </w:tcPr>
-          <w:p>
-            <w:r>
-              <w:t>Scenario</w:t>
-            </w:r>
-          </w:p>
-        </w:tc>
-        <w:tc>
-          <w:tcPr>
-            <w:tcW w:type="dxa" w:w="1728"/>
-          </w:tcPr>
-          <w:p>
-            <w:r>
-              <w:t>Annual Revenue</w:t>
-            </w:r>
-          </w:p>
-        </w:tc>
-        <w:tc>
-          <w:tcPr>
-            <w:tcW w:type="dxa" w:w="1728"/>
-          </w:tcPr>
-          <w:p>
-            <w:r>
-              <w:t>Valuation (7x rev)</w:t>
-            </w:r>
-          </w:p>
-        </w:tc>
-        <w:tc>
-          <w:tcPr>
-            <w:tcW w:type="dxa" w:w="1728"/>
-          </w:tcPr>
-          <w:p>
-            <w:r>
-              <w:t>Your 40%</w:t>
-            </w:r>
-          </w:p>
-        </w:tc>
-        <w:tc>
-          <w:tcPr>
-            <w:tcW w:type="dxa" w:w="1728"/>
-          </w:tcPr>
-          <w:p>
-            <w:r>
-              <w:t>Return Multiple</w:t>
-            </w:r>
-          </w:p>
-        </w:tc>
-      </w:tr>
-      <w:tr>
-        <w:tc>
-          <w:tcPr>
-            <w:tcW w:type="dxa" w:w="1728"/>
-          </w:tcPr>
-          <w:p>
-            <w:r>
-              <w:t>Conservative</w:t>
-            </w:r>
-          </w:p>
-        </w:tc>
-        <w:tc>
-          <w:tcPr>
-            <w:tcW w:type="dxa" w:w="1728"/>
-          </w:tcPr>
-          <w:p>
-            <w:r>
-              <w:t>$720K/year</w:t>
-            </w:r>
-          </w:p>
-        </w:tc>
-        <w:tc>
-          <w:tcPr>
-            <w:tcW w:type="dxa" w:w="1728"/>
-          </w:tcPr>
-          <w:p>
-            <w:r>
-              <w:t>$5M</w:t>
-            </w:r>
-          </w:p>
-        </w:tc>
-        <w:tc>
-          <w:tcPr>
-            <w:tcW w:type="dxa" w:w="1728"/>
-          </w:tcPr>
-          <w:p>
-            <w:r>
-              <w:t>$2M</w:t>
-            </w:r>
-          </w:p>
-        </w:tc>
-        <w:tc>
-          <w:tcPr>
-            <w:tcW w:type="dxa" w:w="1728"/>
-          </w:tcPr>
-          <w:p>
-            <w:r>
-              <w:t>1.6x</w:t>
-            </w:r>
-          </w:p>
-        </w:tc>
-      </w:tr>
-      <w:tr>
-        <w:tc>
-          <w:tcPr>
-            <w:tcW w:type="dxa" w:w="1728"/>
-          </w:tcPr>
-          <w:p>
-            <w:r>
-              <w:t>Base Case</w:t>
-            </w:r>
-          </w:p>
-        </w:tc>
-        <w:tc>
-          <w:tcPr>
-            <w:tcW w:type="dxa" w:w="1728"/>
-          </w:tcPr>
-          <w:p>
-            <w:r>
-              <w:t>$2M/year</w:t>
-            </w:r>
-          </w:p>
-        </w:tc>
-        <w:tc>
-          <w:tcPr>
-            <w:tcW w:type="dxa" w:w="1728"/>
-          </w:tcPr>
-          <w:p>
-            <w:r>
-              <w:t>$15M</w:t>
-            </w:r>
-          </w:p>
-        </w:tc>
-        <w:tc>
-          <w:tcPr>
-            <w:tcW w:type="dxa" w:w="1728"/>
-          </w:tcPr>
-          <w:p>
-            <w:r>
-              <w:t>$6M</w:t>
-            </w:r>
-          </w:p>
-        </w:tc>
-        <w:tc>
-          <w:tcPr>
-            <w:tcW w:type="dxa" w:w="1728"/>
-          </w:tcPr>
-          <w:p>
-            <w:r>
-              <w:t>4.8x</w:t>
-            </w:r>
-          </w:p>
-        </w:tc>
-      </w:tr>
-      <w:tr>
-        <w:tc>
-          <w:tcPr>
-            <w:tcW w:type="dxa" w:w="1728"/>
-          </w:tcPr>
-          <w:p>
-            <w:r>
-              <w:t>Upside</w:t>
-            </w:r>
-          </w:p>
-        </w:tc>
-        <w:tc>
-          <w:tcPr>
-            <w:tcW w:type="dxa" w:w="1728"/>
-          </w:tcPr>
-          <w:p>
-            <w:r>
-              <w:t>$5M/year</w:t>
-            </w:r>
-          </w:p>
-        </w:tc>
-        <w:tc>
-          <w:tcPr>
-            <w:tcW w:type="dxa" w:w="1728"/>
-          </w:tcPr>
-          <w:p>
-            <w:r>
-              <w:t>$40M</w:t>
-            </w:r>
-          </w:p>
-        </w:tc>
-        <w:tc>
-          <w:tcPr>
-            <w:tcW w:type="dxa" w:w="1728"/>
-          </w:tcPr>
-          <w:p>
-            <w:r>
-              <w:t>$16M</w:t>
-            </w:r>
-          </w:p>
-        </w:tc>
-        <w:tc>
-          <w:tcPr>
-            <w:tcW w:type="dxa" w:w="1728"/>
-          </w:tcPr>
-          <w:p>
-            <w:r>
-              <w:t>12.9x</w:t>
-            </w:r>
-          </w:p>
-        </w:tc>
-      </w:tr>
-    </w:tbl>
-    <w:p/>
-    <w:p>
-      <w:r>
-        <w:t>Timeline: Comparable companies reach these valuations in 3-5 years.</w:t>
-      </w:r>
-    </w:p>
-    <w:p>
-      <w:r>
-        <w:t>Exit options: Acquisition by larger company, strategic sale, or ongoing dividends from profits.</w:t>
-      </w:r>
-    </w:p>
-    <w:p>
-      <w:r>
-        <w:br w:type="page"/>
-      </w:r>
-    </w:p>
-    <w:p>
-      <w:pPr>
-        <w:pStyle w:val="Heading1"/>
-      </w:pPr>
-      <w:r>
-        <w:t>10. Team &amp; Strengths</w:t>
-      </w:r>
-    </w:p>
-    <w:p>
-      <w:pPr>
-        <w:pStyle w:val="ListBullet"/>
-      </w:pPr>
-      <w:r>
-        <w:t>Technical founders with AI/ML expertise and production-grade systems</w:t>
-      </w:r>
-    </w:p>
-    <w:p>
-      <w:pPr>
-        <w:pStyle w:val="ListBullet"/>
-      </w:pPr>
-      <w:r>
-        <w:t>Based in Tbilisi — lowest operating costs in Europe with high talent availability</w:t>
-      </w:r>
-    </w:p>
-    <w:p>
-      <w:pPr>
-        <w:pStyle w:val="ListBullet"/>
-      </w:pPr>
-      <w:r>
-        <w:t>Product already built and functional (live at allone.ge)</w:t>
-      </w:r>
-    </w:p>
-    <w:p>
-      <w:pPr>
-        <w:pStyle w:val="ListBullet"/>
-      </w:pPr>
-      <w:r>
-        <w:t>Active sales team of 10 commission-based representatives</w:t>
-      </w:r>
-    </w:p>
-    <w:p>
-      <w:pPr>
-        <w:pStyle w:val="ListBullet"/>
-      </w:pPr>
-      <w:r>
-        <w:t>Access to Georgian tech talent pool and government innovation programs</w:t>
-      </w:r>
-    </w:p>
-    <w:p>
-      <w:pPr>
-        <w:pStyle w:val="ListBullet"/>
-      </w:pPr>
-      <w:r>
-        <w:t>Working relationships with business consultation centres for distribution</w:t>
-      </w:r>
-    </w:p>
-    <w:p>
-      <w:r>
-        <w:br w:type="page"/>
-      </w:r>
-    </w:p>
-    <w:p>
-      <w:pPr>
-        <w:pStyle w:val="Heading1"/>
-      </w:pPr>
-      <w:r>
-        <w:t>11. The Ask</w:t>
-      </w:r>
-    </w:p>
-    <w:p/>
-    <w:p>
-      <w:r>
-        <w:rPr>
-          <w:b/>
-          <w:sz w:val="32"/>
-        </w:rPr>
-        <w:t>Total Investment: $1.24M</w:t>
-      </w:r>
-    </w:p>
-    <w:p>
-      <w:r>
-        <w:rPr>
-          <w:b/>
-          <w:sz w:val="32"/>
-        </w:rPr>
-        <w:t>Total Equity: 40%</w:t>
-      </w:r>
-    </w:p>
-    <w:p/>
-    <w:p>
-      <w:r>
-        <w:t>Structure: Deployed in 3 phases, each tied to clear milestones.</w:t>
-      </w:r>
-    </w:p>
-    <w:p/>
-    <w:tbl>
-      <w:tblPr>
-        <w:tblStyle w:val="LightGrid-Accent1"/>
-        <w:tblW w:type="auto" w:w="0"/>
-        <w:tblLook w:firstColumn="1" w:firstRow="1" w:lastColumn="0" w:lastRow="0" w:noHBand="0" w:noVBand="1" w:val="04A0"/>
-      </w:tblPr>
-      <w:tblGrid>
-        <w:gridCol w:w="2160"/>
-        <w:gridCol w:w="2160"/>
-        <w:gridCol w:w="2160"/>
-        <w:gridCol w:w="2160"/>
-      </w:tblGrid>
-      <w:tr>
-        <w:tc>
-          <w:tcPr>
-            <w:tcW w:type="dxa" w:w="2160"/>
-          </w:tcPr>
-          <w:p>
-            <w:r>
-              <w:t>Phase</w:t>
-            </w:r>
-          </w:p>
-        </w:tc>
-        <w:tc>
-          <w:tcPr>
-            <w:tcW w:type="dxa" w:w="2160"/>
-          </w:tcPr>
-          <w:p>
-            <w:r>
-              <w:t>Amount</w:t>
-            </w:r>
-          </w:p>
-        </w:tc>
-        <w:tc>
-          <w:tcPr>
-            <w:tcW w:type="dxa" w:w="2160"/>
-          </w:tcPr>
-          <w:p>
-            <w:r>
-              <w:t>Equity</w:t>
-            </w:r>
-          </w:p>
-        </w:tc>
-        <w:tc>
-          <w:tcPr>
-            <w:tcW w:type="dxa" w:w="2160"/>
-          </w:tcPr>
-          <w:p>
-            <w:r>
-              <w:t>Trigger</w:t>
-            </w:r>
-          </w:p>
-        </w:tc>
-      </w:tr>
-      <w:tr>
-        <w:tc>
-          <w:tcPr>
-            <w:tcW w:type="dxa" w:w="2160"/>
-          </w:tcPr>
-          <w:p>
-            <w:r>
-              <w:t>Phase 1</w:t>
-            </w:r>
-          </w:p>
-        </w:tc>
-        <w:tc>
-          <w:tcPr>
-            <w:tcW w:type="dxa" w:w="2160"/>
-          </w:tcPr>
-          <w:p>
-            <w:r>
-              <w:t>$40K</w:t>
-            </w:r>
-          </w:p>
-        </w:tc>
-        <w:tc>
-          <w:tcPr>
-            <w:tcW w:type="dxa" w:w="2160"/>
-          </w:tcPr>
-          <w:p>
-            <w:r>
-              <w:t>10%</w:t>
-            </w:r>
-          </w:p>
-        </w:tc>
-        <w:tc>
-          <w:tcPr>
-            <w:tcW w:type="dxa" w:w="2160"/>
-          </w:tcPr>
-          <w:p>
-            <w:r>
-              <w:t>Now — to build &amp; launch</w:t>
-            </w:r>
-          </w:p>
-        </w:tc>
-      </w:tr>
-      <w:tr>
-        <w:tc>
-          <w:tcPr>
-            <w:tcW w:type="dxa" w:w="2160"/>
-          </w:tcPr>
-          <w:p>
-            <w:r>
-              <w:t>Phase 2</w:t>
-            </w:r>
-          </w:p>
-        </w:tc>
-        <w:tc>
-          <w:tcPr>
-            <w:tcW w:type="dxa" w:w="2160"/>
-          </w:tcPr>
-          <w:p>
-            <w:r>
-              <w:t>$200K</w:t>
-            </w:r>
-          </w:p>
-        </w:tc>
-        <w:tc>
-          <w:tcPr>
-            <w:tcW w:type="dxa" w:w="2160"/>
-          </w:tcPr>
-          <w:p>
-            <w:r>
-              <w:t>15%</w:t>
-            </w:r>
-          </w:p>
-        </w:tc>
-        <w:tc>
-          <w:tcPr>
-            <w:tcW w:type="dxa" w:w="2160"/>
-          </w:tcPr>
-          <w:p>
-            <w:r>
-              <w:t>After first revenue milestone</w:t>
-            </w:r>
-          </w:p>
-        </w:tc>
-      </w:tr>
-      <w:tr>
-        <w:tc>
-          <w:tcPr>
-            <w:tcW w:type="dxa" w:w="2160"/>
-          </w:tcPr>
-          <w:p>
-            <w:r>
-              <w:t>Phase 3</w:t>
-            </w:r>
-          </w:p>
-        </w:tc>
-        <w:tc>
-          <w:tcPr>
-            <w:tcW w:type="dxa" w:w="2160"/>
-          </w:tcPr>
-          <w:p>
-            <w:r>
-              <w:t>$1M</w:t>
-            </w:r>
-          </w:p>
-        </w:tc>
-        <w:tc>
-          <w:tcPr>
-            <w:tcW w:type="dxa" w:w="2160"/>
-          </w:tcPr>
-          <w:p>
-            <w:r>
-              <w:t>15%</w:t>
-            </w:r>
-          </w:p>
-        </w:tc>
-        <w:tc>
-          <w:tcPr>
-            <w:tcW w:type="dxa" w:w="2160"/>
-          </w:tcPr>
-          <w:p>
-            <w:r>
-              <w:t>After proven unit economics</w:t>
-            </w:r>
-          </w:p>
-        </w:tc>
-      </w:tr>
-    </w:tbl>
-    <w:p/>
-    <w:p>
-      <w:r>
-        <w:rPr>
-          <w:i/>
-          <w:sz w:val="24"/>
-        </w:rPr>
-        <w:t>You only invest more when we prove each milestone.</w:t>
-      </w:r>
-    </w:p>
-    <w:p>
-      <w:r>
-        <w:br w:type="page"/>
-      </w:r>
-    </w:p>
-    <w:p>
-      <w:pPr>
-        <w:pStyle w:val="Heading1"/>
-      </w:pPr>
-      <w:r>
-        <w:t>12. Risk Factors &amp; Mitigations</w:t>
-      </w:r>
-    </w:p>
-    <w:p>
-      <w:pPr>
-        <w:pStyle w:val="Heading3"/>
-      </w:pPr>
-      <w:r>
-        <w:t>Market Risk</w:t>
-      </w:r>
-    </w:p>
-    <w:p>
-      <w:r>
-        <w:t>Risk: AI automation demand may not materialize as projected</w:t>
-      </w:r>
-    </w:p>
-    <w:p>
-      <w:r>
-        <w:t>Mitigation: Focus on proven use cases (phone answering, chatbots) with immediate ROI for clients</w:t>
-      </w:r>
-    </w:p>
-    <w:p>
-      <w:pPr>
-        <w:pStyle w:val="Heading3"/>
-      </w:pPr>
-      <w:r>
-        <w:t>Technology Risk</w:t>
-      </w:r>
-    </w:p>
-    <w:p>
-      <w:r>
-        <w:t>Risk: Dependence on third-party AI APIs (Claude, etc.)</w:t>
-      </w:r>
-    </w:p>
-    <w:p>
-      <w:r>
-        <w:t>Mitigation: Phase 2 data center provides infrastructure independence; multiple API providers available</w:t>
-      </w:r>
-    </w:p>
-    <w:p>
-      <w:pPr>
-        <w:pStyle w:val="Heading3"/>
-      </w:pPr>
-      <w:r>
-        <w:t>Sales Risk</w:t>
-      </w:r>
-    </w:p>
-    <w:p>
-      <w:r>
-        <w:t>Risk: Commission-only model may not attract enough salespeople</w:t>
-      </w:r>
-    </w:p>
-    <w:p>
-      <w:r>
-        <w:t>Mitigation: Low barrier to entry; proven commission structure; business consultation centre partnerships</w:t>
-      </w:r>
-    </w:p>
-    <w:p>
-      <w:pPr>
-        <w:pStyle w:val="Heading3"/>
-      </w:pPr>
-      <w:r>
-        <w:t>Competition Risk</w:t>
-      </w:r>
-    </w:p>
-    <w:p>
-      <w:r>
-        <w:t>Risk: Larger companies may enter the SMB space</w:t>
-      </w:r>
-    </w:p>
-    <w:p>
-      <w:r>
-        <w:t>Mitigation: Georgia cost advantage creates 3-5x pricing moat; local market knowledge; speed to market</w:t>
-      </w:r>
-    </w:p>
-    <w:p>
-      <w:pPr>
-        <w:pStyle w:val="Heading3"/>
-      </w:pPr>
-      <w:r>
-        <w:t>Execution Risk</w:t>
-      </w:r>
-    </w:p>
-    <w:p>
-      <w:r>
-        <w:t>Risk: Team may not deliver on milestones</w:t>
-      </w:r>
-    </w:p>
-    <w:p>
-      <w:r>
-        <w:t>Mitigation: Milestone-gated investment structure protects investor; each phase proves next</w:t>
+        <w:t>3 paid clients — product live at allone.ge</w:t>
       </w:r>
     </w:p>
     <w:sectPr>

</xml_diff>